<commit_message>
Avance de evidencias grupales
Se desarrollo el avance del archivo:
2.4_GuiaEstudiante_Fase 2_DesarrolloProyecto APT
</commit_message>
<xml_diff>
--- a/Fase 2/Evidencias Grupales/2.4_GuiaEstudiante_Fase 2_DesarrolloProyecto APT.docx
+++ b/Fase 2/Evidencias Grupales/2.4_GuiaEstudiante_Fase 2_DesarrolloProyecto APT.docx
@@ -1,11 +1,8 @@
 
 <file path=word/document.xml><?xml version="1.0" encoding="utf-8"?>
-<w:document xmlns:wpc="http://schemas.microsoft.com/office/word/2010/wordprocessingCanvas" xmlns:cx="http://schemas.microsoft.com/office/drawing/2014/chartex" xmlns:mc="http://schemas.openxmlformats.org/markup-compatibility/2006" xmlns:o="urn:schemas-microsoft-com:office:office" xmlns:r="http://schemas.openxmlformats.org/officeDocument/2006/relationships" xmlns:m="http://schemas.openxmlformats.org/officeDocument/2006/math" xmlns:v="urn:schemas-microsoft-com:vml" xmlns:wp14="http://schemas.microsoft.com/office/word/2010/wordprocessingDrawing" xmlns:wp="http://schemas.openxmlformats.org/drawingml/2006/wordprocessingDrawing" xmlns:w10="urn:schemas-microsoft-com:office:word" xmlns:w="http://schemas.openxmlformats.org/wordprocessingml/2006/main" xmlns:w14="http://schemas.microsoft.com/office/word/2010/wordml" xmlns:w15="http://schemas.microsoft.com/office/word/2012/wordml" xmlns:w16se="http://schemas.microsoft.com/office/word/2015/wordml/symex" xmlns:wpg="http://schemas.microsoft.com/office/word/2010/wordprocessingGroup" xmlns:wpi="http://schemas.microsoft.com/office/word/2010/wordprocessingInk" xmlns:wne="http://schemas.microsoft.com/office/word/2006/wordml" xmlns:wps="http://schemas.microsoft.com/office/word/2010/wordprocessingShape" mc:Ignorable="w14 w15 w16se wp14">
+<w:document xmlns:wpc="http://schemas.microsoft.com/office/word/2010/wordprocessingCanvas" xmlns:cx="http://schemas.microsoft.com/office/drawing/2014/chartex" xmlns:cx1="http://schemas.microsoft.com/office/drawing/2015/9/8/chartex" xmlns:cx2="http://schemas.microsoft.com/office/drawing/2015/10/21/chartex" xmlns:cx3="http://schemas.microsoft.com/office/drawing/2016/5/9/chartex" xmlns:cx4="http://schemas.microsoft.com/office/drawing/2016/5/10/chartex" xmlns:cx5="http://schemas.microsoft.com/office/drawing/2016/5/11/chartex" xmlns:cx6="http://schemas.microsoft.com/office/drawing/2016/5/12/chartex" xmlns:cx7="http://schemas.microsoft.com/office/drawing/2016/5/13/chartex" xmlns:cx8="http://schemas.microsoft.com/office/drawing/2016/5/14/chartex" xmlns:mc="http://schemas.openxmlformats.org/markup-compatibility/2006" xmlns:aink="http://schemas.microsoft.com/office/drawing/2016/ink" xmlns:am3d="http://schemas.microsoft.com/office/drawing/2017/model3d" xmlns:o="urn:schemas-microsoft-com:office:office" xmlns:r="http://schemas.openxmlformats.org/officeDocument/2006/relationships" xmlns:m="http://schemas.openxmlformats.org/officeDocument/2006/math" xmlns:v="urn:schemas-microsoft-com:vml" xmlns:wp14="http://schemas.microsoft.com/office/word/2010/wordprocessingDrawing" xmlns:wp="http://schemas.openxmlformats.org/drawingml/2006/wordprocessingDrawing" xmlns:w10="urn:schemas-microsoft-com:office:word" xmlns:w="http://schemas.openxmlformats.org/wordprocessingml/2006/main" xmlns:w14="http://schemas.microsoft.com/office/word/2010/wordml" xmlns:w15="http://schemas.microsoft.com/office/word/2012/wordml" xmlns:w16cex="http://schemas.microsoft.com/office/word/2018/wordml/cex" xmlns:w16cid="http://schemas.microsoft.com/office/word/2016/wordml/cid" xmlns:w16="http://schemas.microsoft.com/office/word/2018/wordml" xmlns:w16sdtdh="http://schemas.microsoft.com/office/word/2020/wordml/sdtdatahash" xmlns:w16se="http://schemas.microsoft.com/office/word/2015/wordml/symex" xmlns:wpg="http://schemas.microsoft.com/office/word/2010/wordprocessingGroup" xmlns:wpi="http://schemas.microsoft.com/office/word/2010/wordprocessingInk" xmlns:wne="http://schemas.microsoft.com/office/word/2006/wordml" xmlns:wps="http://schemas.microsoft.com/office/word/2010/wordprocessingShape" mc:Ignorable="w14 w15 w16se w16cid w16 w16cex w16sdtdh wp14">
   <w:body>
-    <w:p>
-      <w:bookmarkStart w:id="0" w:name="_GoBack"/>
-      <w:bookmarkEnd w:id="0"/>
-    </w:p>
+    <w:p/>
     <w:p>
       <w:pPr>
         <w:rPr>
@@ -165,6 +162,7 @@
                                 </w:rPr>
                                 <w:t xml:space="preserve">Asignatura </w:t>
                               </w:r>
+                              <w:proofErr w:type="spellStart"/>
                               <w:r>
                                 <w:rPr>
                                   <w:b/>
@@ -174,6 +172,7 @@
                                 </w:rPr>
                                 <w:t>Capstone</w:t>
                               </w:r>
+                              <w:proofErr w:type="spellEnd"/>
                             </w:p>
                           </w:txbxContent>
                         </wps:txbx>
@@ -2306,6 +2305,155 @@
           </w:p>
         </w:tc>
       </w:tr>
+      <w:tr>
+        <w:trPr>
+          <w:trHeight w:val="2410"/>
+        </w:trPr>
+        <w:tc>
+          <w:tcPr>
+            <w:tcW w:w="1328" w:type="dxa"/>
+          </w:tcPr>
+          <w:p>
+            <w:pPr>
+              <w:jc w:val="both"/>
+              <w:rPr>
+                <w:rFonts w:ascii="Calibri" w:hAnsi="Calibri" w:cs="Arial"/>
+                <w:i/>
+                <w:color w:val="548DD4"/>
+                <w:sz w:val="18"/>
+                <w:szCs w:val="20"/>
+                <w:lang w:eastAsia="es-CL"/>
+              </w:rPr>
+            </w:pPr>
+          </w:p>
+        </w:tc>
+        <w:tc>
+          <w:tcPr>
+            <w:tcW w:w="1077" w:type="dxa"/>
+          </w:tcPr>
+          <w:p>
+            <w:pPr>
+              <w:jc w:val="both"/>
+              <w:rPr>
+                <w:rFonts w:ascii="Calibri" w:hAnsi="Calibri" w:cs="Arial"/>
+                <w:i/>
+                <w:color w:val="548DD4"/>
+                <w:sz w:val="18"/>
+                <w:szCs w:val="20"/>
+                <w:lang w:eastAsia="es-CL"/>
+              </w:rPr>
+            </w:pPr>
+          </w:p>
+        </w:tc>
+        <w:tc>
+          <w:tcPr>
+            <w:tcW w:w="1276" w:type="dxa"/>
+          </w:tcPr>
+          <w:p>
+            <w:pPr>
+              <w:jc w:val="both"/>
+              <w:rPr>
+                <w:rFonts w:ascii="Calibri" w:hAnsi="Calibri" w:cs="Arial"/>
+                <w:i/>
+                <w:color w:val="548DD4"/>
+                <w:sz w:val="18"/>
+                <w:szCs w:val="20"/>
+                <w:lang w:eastAsia="es-CL"/>
+              </w:rPr>
+            </w:pPr>
+          </w:p>
+        </w:tc>
+        <w:tc>
+          <w:tcPr>
+            <w:tcW w:w="1276" w:type="dxa"/>
+          </w:tcPr>
+          <w:p>
+            <w:pPr>
+              <w:jc w:val="both"/>
+              <w:rPr>
+                <w:rFonts w:ascii="Calibri" w:hAnsi="Calibri" w:cs="Arial"/>
+                <w:i/>
+                <w:color w:val="548DD4"/>
+                <w:sz w:val="18"/>
+                <w:szCs w:val="20"/>
+                <w:lang w:eastAsia="es-CL"/>
+              </w:rPr>
+            </w:pPr>
+          </w:p>
+        </w:tc>
+        <w:tc>
+          <w:tcPr>
+            <w:tcW w:w="1275" w:type="dxa"/>
+          </w:tcPr>
+          <w:p>
+            <w:pPr>
+              <w:jc w:val="both"/>
+              <w:rPr>
+                <w:rFonts w:ascii="Calibri" w:hAnsi="Calibri" w:cs="Arial"/>
+                <w:i/>
+                <w:color w:val="548DD4"/>
+                <w:sz w:val="18"/>
+                <w:szCs w:val="20"/>
+                <w:lang w:eastAsia="es-CL"/>
+              </w:rPr>
+            </w:pPr>
+          </w:p>
+        </w:tc>
+        <w:tc>
+          <w:tcPr>
+            <w:tcW w:w="1276" w:type="dxa"/>
+          </w:tcPr>
+          <w:p>
+            <w:pPr>
+              <w:jc w:val="both"/>
+              <w:rPr>
+                <w:rFonts w:ascii="Calibri" w:hAnsi="Calibri" w:cs="Arial"/>
+                <w:i/>
+                <w:color w:val="548DD4"/>
+                <w:sz w:val="18"/>
+                <w:szCs w:val="20"/>
+                <w:lang w:eastAsia="es-CL"/>
+              </w:rPr>
+            </w:pPr>
+          </w:p>
+        </w:tc>
+        <w:tc>
+          <w:tcPr>
+            <w:tcW w:w="1418" w:type="dxa"/>
+          </w:tcPr>
+          <w:p>
+            <w:pPr>
+              <w:jc w:val="both"/>
+              <w:rPr>
+                <w:rFonts w:ascii="Calibri" w:hAnsi="Calibri" w:cs="Arial"/>
+                <w:i/>
+                <w:color w:val="548DD4"/>
+                <w:sz w:val="18"/>
+                <w:szCs w:val="20"/>
+                <w:lang w:eastAsia="es-CL"/>
+              </w:rPr>
+            </w:pPr>
+          </w:p>
+        </w:tc>
+        <w:tc>
+          <w:tcPr>
+            <w:tcW w:w="850" w:type="dxa"/>
+          </w:tcPr>
+          <w:p>
+            <w:pPr>
+              <w:jc w:val="both"/>
+              <w:rPr>
+                <w:rFonts w:ascii="Calibri" w:hAnsi="Calibri" w:cs="Arial"/>
+                <w:i/>
+                <w:color w:val="548DD4"/>
+                <w:sz w:val="18"/>
+                <w:szCs w:val="20"/>
+                <w:lang w:eastAsia="es-CL"/>
+              </w:rPr>
+            </w:pPr>
+          </w:p>
+        </w:tc>
+      </w:tr>
     </w:tbl>
     <w:p>
       <w:pPr>
@@ -2511,14 +2659,16 @@
                 <w:color w:val="548DD4"/>
                 <w:sz w:val="20"/>
                 <w:szCs w:val="20"/>
-                <w:lang w:eastAsia="es-CL"/>
-              </w:rPr>
-            </w:pPr>
-            <w:r>
-              <w:rPr>
-                <w:rFonts w:ascii="Calibri" w:hAnsi="Calibri"/>
-                <w:color w:val="1F3864" w:themeColor="accent1" w:themeShade="80"/>
-              </w:rPr>
+                <w:u w:val="single"/>
+                <w:lang w:eastAsia="es-CL"/>
+              </w:rPr>
+            </w:pPr>
+            <w:r>
+              <w:rPr>
+                <w:rFonts w:ascii="Calibri" w:hAnsi="Calibri"/>
+                <w:color w:val="1F3864" w:themeColor="accent1" w:themeShade="80"/>
+              </w:rPr>
+              <w:lastRenderedPageBreak/>
               <w:t>Factores que han f</w:t>
             </w:r>
             <w:r>
@@ -2559,112 +2709,102 @@
               </w:rPr>
               <w:t xml:space="preserve">: </w:t>
             </w:r>
-            <w:r>
-              <w:rPr>
-                <w:rFonts w:ascii="Calibri" w:hAnsi="Calibri" w:cs="Arial"/>
-                <w:i/>
-                <w:iCs/>
-                <w:color w:val="548DD4"/>
-                <w:sz w:val="20"/>
-                <w:szCs w:val="20"/>
-                <w:lang w:eastAsia="es-CL"/>
-              </w:rPr>
-              <w:t>Describe los factores que han facilitado y</w:t>
-            </w:r>
-            <w:r>
-              <w:rPr>
-                <w:rFonts w:ascii="Calibri" w:hAnsi="Calibri" w:cs="Arial"/>
-                <w:i/>
-                <w:iCs/>
-                <w:color w:val="548DD4"/>
-                <w:sz w:val="20"/>
-                <w:szCs w:val="20"/>
-                <w:lang w:eastAsia="es-CL"/>
-              </w:rPr>
-              <w:t>/o</w:t>
-            </w:r>
-            <w:r>
-              <w:rPr>
-                <w:rFonts w:ascii="Calibri" w:hAnsi="Calibri" w:cs="Arial"/>
-                <w:i/>
-                <w:iCs/>
-                <w:color w:val="548DD4"/>
-                <w:sz w:val="20"/>
-                <w:szCs w:val="20"/>
-                <w:lang w:eastAsia="es-CL"/>
-              </w:rPr>
-              <w:t xml:space="preserve"> dificultado el desarrollo de tu Proyecto APT hasta ahora. En el caso de las dificultades</w:t>
-            </w:r>
-            <w:r>
-              <w:rPr>
-                <w:rFonts w:ascii="Calibri" w:hAnsi="Calibri" w:cs="Arial"/>
-                <w:i/>
-                <w:iCs/>
-                <w:color w:val="548DD4"/>
-                <w:sz w:val="20"/>
-                <w:szCs w:val="20"/>
-                <w:lang w:eastAsia="es-CL"/>
-              </w:rPr>
-              <w:t xml:space="preserve"> debes describir</w:t>
-            </w:r>
-            <w:r>
-              <w:rPr>
-                <w:rFonts w:ascii="Calibri" w:hAnsi="Calibri" w:cs="Arial"/>
-                <w:i/>
-                <w:iCs/>
-                <w:color w:val="548DD4"/>
-                <w:sz w:val="20"/>
-                <w:szCs w:val="20"/>
-                <w:lang w:eastAsia="es-CL"/>
-              </w:rPr>
-              <w:t xml:space="preserve"> qué acciones tomaste y/o tomarás para </w:t>
-            </w:r>
-            <w:r>
-              <w:rPr>
-                <w:rFonts w:ascii="Calibri" w:hAnsi="Calibri" w:cs="Arial"/>
-                <w:i/>
-                <w:iCs/>
-                <w:color w:val="548DD4"/>
-                <w:sz w:val="20"/>
-                <w:szCs w:val="20"/>
-                <w:lang w:eastAsia="es-CL"/>
-              </w:rPr>
-              <w:t xml:space="preserve">solucionarlas. </w:t>
-            </w:r>
-            <w:r>
-              <w:rPr>
-                <w:rFonts w:ascii="Calibri" w:hAnsi="Calibri"/>
-                <w:b/>
-                <w:color w:val="1F3864" w:themeColor="accent1" w:themeShade="80"/>
-              </w:rPr>
-              <w:t xml:space="preserve"> </w:t>
-            </w:r>
-          </w:p>
-          <w:p>
-            <w:pPr>
-              <w:rPr>
-                <w:rFonts w:ascii="Calibri" w:hAnsi="Calibri"/>
-                <w:color w:val="1F3864" w:themeColor="accent1" w:themeShade="80"/>
-              </w:rPr>
-            </w:pPr>
-          </w:p>
-          <w:p>
-            <w:pPr>
-              <w:rPr>
-                <w:rFonts w:ascii="Calibri" w:hAnsi="Calibri"/>
-                <w:color w:val="1F3864" w:themeColor="accent1" w:themeShade="80"/>
-              </w:rPr>
-            </w:pPr>
-          </w:p>
-          <w:p>
-            <w:pPr>
-              <w:jc w:val="both"/>
-              <w:rPr>
-                <w:rFonts w:ascii="Calibri" w:hAnsi="Calibri" w:cs="Arial"/>
-                <w:i/>
-                <w:color w:val="548DD4"/>
-                <w:sz w:val="20"/>
-                <w:szCs w:val="20"/>
+          </w:p>
+          <w:p>
+            <w:pPr>
+              <w:jc w:val="both"/>
+              <w:rPr>
+                <w:rFonts w:ascii="Calibri" w:hAnsi="Calibri" w:cs="Arial"/>
+                <w:sz w:val="20"/>
+                <w:szCs w:val="20"/>
+                <w:lang w:eastAsia="es-CL"/>
+              </w:rPr>
+            </w:pPr>
+            <w:r>
+              <w:rPr>
+                <w:rFonts w:ascii="Calibri" w:hAnsi="Calibri" w:cs="Arial"/>
+                <w:sz w:val="20"/>
+                <w:szCs w:val="20"/>
+                <w:lang w:eastAsia="es-CL"/>
+              </w:rPr>
+              <w:t xml:space="preserve">El tener una gran comunicación al momento de ir desarrollando el proyecto nos ayudó a poder entender y saber en </w:t>
+            </w:r>
+            <w:proofErr w:type="spellStart"/>
+            <w:r>
+              <w:rPr>
+                <w:rFonts w:ascii="Calibri" w:hAnsi="Calibri" w:cs="Arial"/>
+                <w:sz w:val="20"/>
+                <w:szCs w:val="20"/>
+                <w:lang w:eastAsia="es-CL"/>
+              </w:rPr>
+              <w:t>que</w:t>
+            </w:r>
+            <w:proofErr w:type="spellEnd"/>
+            <w:r>
+              <w:rPr>
+                <w:rFonts w:ascii="Calibri" w:hAnsi="Calibri" w:cs="Arial"/>
+                <w:sz w:val="20"/>
+                <w:szCs w:val="20"/>
+                <w:lang w:eastAsia="es-CL"/>
+              </w:rPr>
+              <w:t xml:space="preserve"> se ha ido avanzando en el mismo al momento, por lo cual nos ayudó a poder hacer un gran desarrollo hasta ahora,</w:t>
+            </w:r>
+            <w:r>
+              <w:rPr>
+                <w:rFonts w:ascii="Calibri" w:hAnsi="Calibri" w:cs="Arial"/>
+                <w:sz w:val="20"/>
+                <w:szCs w:val="20"/>
+                <w:lang w:eastAsia="es-CL"/>
+              </w:rPr>
+              <w:t xml:space="preserve"> las dificultades que tuvimos fueron respecto a herramientas o tecnologías que no se llegaron a utilizar antes, tales como </w:t>
+            </w:r>
+            <w:proofErr w:type="spellStart"/>
+            <w:r>
+              <w:rPr>
+                <w:rFonts w:ascii="Calibri" w:hAnsi="Calibri" w:cs="Arial"/>
+                <w:sz w:val="20"/>
+                <w:szCs w:val="20"/>
+                <w:lang w:eastAsia="es-CL"/>
+              </w:rPr>
+              <w:t>API’s</w:t>
+            </w:r>
+            <w:proofErr w:type="spellEnd"/>
+            <w:r>
+              <w:rPr>
+                <w:rFonts w:ascii="Calibri" w:hAnsi="Calibri" w:cs="Arial"/>
+                <w:sz w:val="20"/>
+                <w:szCs w:val="20"/>
+                <w:lang w:eastAsia="es-CL"/>
+              </w:rPr>
+              <w:t>, librerías y sistemas para poder mostrar el sistema en un servidor web.</w:t>
+            </w:r>
+          </w:p>
+          <w:p>
+            <w:pPr>
+              <w:rPr>
+                <w:rFonts w:ascii="Calibri" w:hAnsi="Calibri"/>
+                <w:color w:val="1F3864" w:themeColor="accent1" w:themeShade="80"/>
+              </w:rPr>
+            </w:pPr>
+          </w:p>
+          <w:p>
+            <w:pPr>
+              <w:rPr>
+                <w:rFonts w:ascii="Calibri" w:hAnsi="Calibri"/>
+                <w:color w:val="1F3864" w:themeColor="accent1" w:themeShade="80"/>
+              </w:rPr>
+            </w:pPr>
+          </w:p>
+          <w:p>
+            <w:pPr>
+              <w:jc w:val="both"/>
+              <w:rPr>
+                <w:rFonts w:ascii="Calibri" w:hAnsi="Calibri" w:cs="Arial"/>
+                <w:i/>
+                <w:color w:val="548DD4"/>
+                <w:sz w:val="20"/>
+                <w:szCs w:val="20"/>
+                <w:u w:val="single"/>
                 <w:lang w:eastAsia="es-CL"/>
               </w:rPr>
             </w:pPr>
@@ -2753,135 +2893,52 @@
                 <w:rFonts w:ascii="Calibri" w:hAnsi="Calibri"/>
                 <w:color w:val="1F3864" w:themeColor="accent1" w:themeShade="80"/>
               </w:rPr>
-              <w:lastRenderedPageBreak/>
               <w:t xml:space="preserve">Actividades ajustadas o eliminadas: </w:t>
             </w:r>
-            <w:r>
-              <w:rPr>
-                <w:rFonts w:ascii="Calibri" w:hAnsi="Calibri" w:cs="Arial"/>
-                <w:i/>
-                <w:color w:val="548DD4"/>
-                <w:sz w:val="20"/>
-                <w:szCs w:val="20"/>
-                <w:lang w:eastAsia="es-CL"/>
-              </w:rPr>
-              <w:t>Señalar los ajustes</w:t>
-            </w:r>
-            <w:r>
-              <w:rPr>
-                <w:rFonts w:ascii="Calibri" w:hAnsi="Calibri" w:cs="Arial"/>
-                <w:i/>
-                <w:color w:val="548DD4"/>
-                <w:sz w:val="20"/>
-                <w:szCs w:val="20"/>
-                <w:lang w:eastAsia="es-CL"/>
-              </w:rPr>
-              <w:t xml:space="preserve"> que realizaste a tu plan de trabajo o </w:t>
-            </w:r>
-            <w:r>
-              <w:rPr>
-                <w:rFonts w:ascii="Calibri" w:hAnsi="Calibri" w:cs="Arial"/>
-                <w:i/>
-                <w:color w:val="548DD4"/>
-                <w:sz w:val="20"/>
-                <w:szCs w:val="20"/>
-                <w:lang w:eastAsia="es-CL"/>
-              </w:rPr>
-              <w:t>actividades que</w:t>
-            </w:r>
-            <w:r>
-              <w:rPr>
-                <w:rFonts w:ascii="Calibri" w:hAnsi="Calibri" w:cs="Arial"/>
-                <w:i/>
-                <w:color w:val="548DD4"/>
-                <w:sz w:val="20"/>
-                <w:szCs w:val="20"/>
-                <w:lang w:eastAsia="es-CL"/>
-              </w:rPr>
-              <w:t xml:space="preserve"> eliminaste</w:t>
-            </w:r>
-            <w:r>
-              <w:rPr>
-                <w:rFonts w:ascii="Calibri" w:hAnsi="Calibri" w:cs="Arial"/>
-                <w:i/>
-                <w:color w:val="548DD4"/>
-                <w:sz w:val="20"/>
-                <w:szCs w:val="20"/>
-                <w:lang w:eastAsia="es-CL"/>
-              </w:rPr>
-              <w:t xml:space="preserve"> y</w:t>
-            </w:r>
-            <w:r>
-              <w:rPr>
-                <w:rFonts w:ascii="Calibri" w:hAnsi="Calibri" w:cs="Arial"/>
-                <w:i/>
-                <w:color w:val="548DD4"/>
-                <w:sz w:val="20"/>
-                <w:szCs w:val="20"/>
-                <w:lang w:eastAsia="es-CL"/>
-              </w:rPr>
-              <w:t>,</w:t>
-            </w:r>
-            <w:r>
-              <w:rPr>
-                <w:rFonts w:ascii="Calibri" w:hAnsi="Calibri" w:cs="Arial"/>
-                <w:i/>
-                <w:color w:val="548DD4"/>
-                <w:sz w:val="20"/>
-                <w:szCs w:val="20"/>
-                <w:lang w:eastAsia="es-CL"/>
-              </w:rPr>
-              <w:t xml:space="preserve"> justifica por</w:t>
-            </w:r>
-            <w:r>
-              <w:rPr>
-                <w:rFonts w:ascii="Calibri" w:hAnsi="Calibri" w:cs="Arial"/>
-                <w:i/>
-                <w:color w:val="548DD4"/>
-                <w:sz w:val="20"/>
-                <w:szCs w:val="20"/>
-                <w:lang w:eastAsia="es-CL"/>
-              </w:rPr>
-              <w:t xml:space="preserve"> </w:t>
-            </w:r>
-            <w:r>
-              <w:rPr>
-                <w:rFonts w:ascii="Calibri" w:hAnsi="Calibri" w:cs="Arial"/>
-                <w:i/>
-                <w:color w:val="548DD4"/>
-                <w:sz w:val="20"/>
-                <w:szCs w:val="20"/>
-                <w:lang w:eastAsia="es-CL"/>
-              </w:rPr>
-              <w:t xml:space="preserve">qué lo hiciste. </w:t>
-            </w:r>
-            <w:r>
-              <w:t xml:space="preserve"> </w:t>
-            </w:r>
-            <w:r>
-              <w:rPr>
-                <w:rFonts w:ascii="Calibri" w:hAnsi="Calibri" w:cs="Arial"/>
-                <w:i/>
-                <w:color w:val="548DD4"/>
-                <w:sz w:val="20"/>
-                <w:szCs w:val="20"/>
-                <w:lang w:eastAsia="es-CL"/>
-              </w:rPr>
-              <w:t>En el caso de que tu plan de trabajo no haya requerido ni requiera ajustes, justifica esta decisión a partir de los facilitadores que te han permitido desarrollarlo como fue planeado.</w:t>
-            </w:r>
-          </w:p>
-          <w:p>
-            <w:pPr>
-              <w:jc w:val="both"/>
-              <w:rPr>
-                <w:rFonts w:ascii="Calibri" w:hAnsi="Calibri" w:cs="Arial"/>
-                <w:i/>
-                <w:color w:val="548DD4"/>
-                <w:sz w:val="20"/>
-                <w:szCs w:val="20"/>
-                <w:lang w:eastAsia="es-CL"/>
-              </w:rPr>
-            </w:pPr>
+          </w:p>
+          <w:p>
+            <w:pPr>
+              <w:jc w:val="both"/>
+              <w:rPr>
+                <w:rFonts w:ascii="Calibri" w:hAnsi="Calibri" w:cs="Arial"/>
+                <w:iCs/>
+                <w:sz w:val="20"/>
+                <w:szCs w:val="20"/>
+                <w:lang w:eastAsia="es-CL"/>
+              </w:rPr>
+            </w:pPr>
+            <w:r>
+              <w:rPr>
+                <w:rFonts w:ascii="Calibri" w:hAnsi="Calibri" w:cs="Arial"/>
+                <w:iCs/>
+                <w:sz w:val="20"/>
+                <w:szCs w:val="20"/>
+                <w:lang w:eastAsia="es-CL"/>
+              </w:rPr>
+              <w:t xml:space="preserve">Un ajuste el cual se decidió realizar para el plan de trabajo fue el hacer que el proyecto sea de arquitectura hibrida, es decir, tener nuestro MVT (Modelo Vista </w:t>
+            </w:r>
+            <w:proofErr w:type="spellStart"/>
+            <w:r>
+              <w:rPr>
+                <w:rFonts w:ascii="Calibri" w:hAnsi="Calibri" w:cs="Arial"/>
+                <w:iCs/>
+                <w:sz w:val="20"/>
+                <w:szCs w:val="20"/>
+                <w:lang w:eastAsia="es-CL"/>
+              </w:rPr>
+              <w:t>Template</w:t>
+            </w:r>
+            <w:proofErr w:type="spellEnd"/>
+            <w:r>
+              <w:rPr>
+                <w:rFonts w:ascii="Calibri" w:hAnsi="Calibri" w:cs="Arial"/>
+                <w:iCs/>
+                <w:sz w:val="20"/>
+                <w:szCs w:val="20"/>
+                <w:lang w:eastAsia="es-CL"/>
+              </w:rPr>
+              <w:t>) y además separado un microservicio el cual manejaría todo lo relacionado a la navegación por voz, decidimos hacer este cambio, ya que de esta manera podremos encajar nuestro enfoque principal del proyecto en otras áreas relacionadas a la web, a su vez, nos permitirá mantener en pie cada parte del proyecto, así en el caso de que se caiga el microservicio la página web podrá seguir funcionando correctamente y viceversa.</w:t>
+            </w:r>
           </w:p>
           <w:p>
             <w:pPr>
@@ -3049,167 +3106,28 @@
               </w:rPr>
               <w:t xml:space="preserve"> </w:t>
             </w:r>
-            <w:r>
-              <w:rPr>
-                <w:rFonts w:ascii="Calibri" w:hAnsi="Calibri" w:cs="Arial"/>
-                <w:i/>
-                <w:color w:val="548DD4"/>
-                <w:sz w:val="20"/>
-                <w:szCs w:val="20"/>
-                <w:lang w:eastAsia="es-CL"/>
-              </w:rPr>
-              <w:t>En caso</w:t>
-            </w:r>
-            <w:r>
-              <w:rPr>
-                <w:rFonts w:ascii="Calibri" w:hAnsi="Calibri" w:cs="Arial"/>
-                <w:i/>
-                <w:color w:val="548DD4"/>
-                <w:sz w:val="20"/>
-                <w:szCs w:val="20"/>
-                <w:lang w:eastAsia="es-CL"/>
-              </w:rPr>
-              <w:t xml:space="preserve"> de</w:t>
-            </w:r>
-            <w:r>
-              <w:rPr>
-                <w:rFonts w:ascii="Calibri" w:hAnsi="Calibri" w:cs="Arial"/>
-                <w:i/>
-                <w:color w:val="548DD4"/>
-                <w:sz w:val="20"/>
-                <w:szCs w:val="20"/>
-                <w:lang w:eastAsia="es-CL"/>
-              </w:rPr>
-              <w:t xml:space="preserve"> que </w:t>
-            </w:r>
-            <w:r>
-              <w:rPr>
-                <w:rFonts w:ascii="Calibri" w:hAnsi="Calibri" w:cs="Arial"/>
-                <w:b/>
-                <w:i/>
-                <w:color w:val="548DD4"/>
-                <w:sz w:val="20"/>
-                <w:szCs w:val="20"/>
-                <w:lang w:eastAsia="es-CL"/>
-              </w:rPr>
-              <w:t>no ha</w:t>
-            </w:r>
-            <w:r>
-              <w:rPr>
-                <w:rFonts w:ascii="Calibri" w:hAnsi="Calibri" w:cs="Arial"/>
-                <w:b/>
-                <w:i/>
-                <w:color w:val="548DD4"/>
-                <w:sz w:val="20"/>
-                <w:szCs w:val="20"/>
-                <w:lang w:eastAsia="es-CL"/>
-              </w:rPr>
-              <w:t>yas</w:t>
-            </w:r>
-            <w:r>
-              <w:rPr>
-                <w:rFonts w:ascii="Calibri" w:hAnsi="Calibri" w:cs="Arial"/>
-                <w:b/>
-                <w:i/>
-                <w:color w:val="548DD4"/>
-                <w:sz w:val="20"/>
-                <w:szCs w:val="20"/>
-                <w:lang w:eastAsia="es-CL"/>
-              </w:rPr>
-              <w:t xml:space="preserve"> iniciado actividades o est</w:t>
-            </w:r>
-            <w:r>
-              <w:rPr>
-                <w:rFonts w:ascii="Calibri" w:hAnsi="Calibri" w:cs="Arial"/>
-                <w:b/>
-                <w:i/>
-                <w:color w:val="548DD4"/>
-                <w:sz w:val="20"/>
-                <w:szCs w:val="20"/>
-                <w:lang w:eastAsia="es-CL"/>
-              </w:rPr>
-              <w:t>é</w:t>
-            </w:r>
-            <w:r>
-              <w:rPr>
-                <w:rFonts w:ascii="Calibri" w:hAnsi="Calibri" w:cs="Arial"/>
-                <w:b/>
-                <w:i/>
-                <w:color w:val="548DD4"/>
-                <w:sz w:val="20"/>
-                <w:szCs w:val="20"/>
-                <w:lang w:eastAsia="es-CL"/>
-              </w:rPr>
-              <w:t>n retrasadas</w:t>
-            </w:r>
-            <w:r>
-              <w:rPr>
-                <w:rFonts w:ascii="Calibri" w:hAnsi="Calibri" w:cs="Arial"/>
-                <w:i/>
-                <w:color w:val="548DD4"/>
-                <w:sz w:val="20"/>
-                <w:szCs w:val="20"/>
-                <w:lang w:eastAsia="es-CL"/>
-              </w:rPr>
-              <w:t xml:space="preserve"> de acuerdo a tu planificación</w:t>
-            </w:r>
-            <w:r>
-              <w:rPr>
-                <w:rFonts w:ascii="Calibri" w:hAnsi="Calibri" w:cs="Arial"/>
-                <w:i/>
-                <w:color w:val="548DD4"/>
-                <w:sz w:val="20"/>
-                <w:szCs w:val="20"/>
-                <w:lang w:eastAsia="es-CL"/>
-              </w:rPr>
-              <w:t>,</w:t>
-            </w:r>
-            <w:r>
-              <w:rPr>
-                <w:rFonts w:ascii="Calibri" w:hAnsi="Calibri" w:cs="Arial"/>
-                <w:i/>
-                <w:color w:val="548DD4"/>
-                <w:sz w:val="20"/>
-                <w:szCs w:val="20"/>
-                <w:lang w:eastAsia="es-CL"/>
-              </w:rPr>
-              <w:t xml:space="preserve"> señala los motivos por lo</w:t>
-            </w:r>
-            <w:r>
-              <w:rPr>
-                <w:rFonts w:ascii="Calibri" w:hAnsi="Calibri" w:cs="Arial"/>
-                <w:i/>
-                <w:color w:val="548DD4"/>
-                <w:sz w:val="20"/>
-                <w:szCs w:val="20"/>
-                <w:lang w:eastAsia="es-CL"/>
-              </w:rPr>
-              <w:t>s</w:t>
-            </w:r>
-            <w:r>
-              <w:rPr>
-                <w:rFonts w:ascii="Calibri" w:hAnsi="Calibri" w:cs="Arial"/>
-                <w:i/>
-                <w:color w:val="548DD4"/>
-                <w:sz w:val="20"/>
-                <w:szCs w:val="20"/>
-                <w:lang w:eastAsia="es-CL"/>
-              </w:rPr>
-              <w:t xml:space="preserve"> que no has podido cumplir dichos plazos y qué estrategias utilizarás para avanzar en dichas actividades y no afectar tu proyecto APT. </w:t>
-            </w:r>
-          </w:p>
-          <w:p>
-            <w:pPr>
-              <w:jc w:val="both"/>
-              <w:rPr>
-                <w:rFonts w:ascii="Calibri" w:hAnsi="Calibri" w:cs="Arial"/>
-                <w:i/>
-                <w:color w:val="548DD4"/>
-                <w:sz w:val="20"/>
-                <w:szCs w:val="20"/>
-                <w:lang w:eastAsia="es-CL"/>
-              </w:rPr>
-            </w:pPr>
+          </w:p>
+          <w:p>
+            <w:pPr>
+              <w:jc w:val="both"/>
+              <w:rPr>
+                <w:rFonts w:ascii="Calibri" w:hAnsi="Calibri" w:cs="Arial"/>
+                <w:iCs/>
+                <w:sz w:val="20"/>
+                <w:szCs w:val="20"/>
+                <w:lang w:eastAsia="es-CL"/>
+              </w:rPr>
+            </w:pPr>
+            <w:r>
+              <w:rPr>
+                <w:rFonts w:ascii="Calibri" w:hAnsi="Calibri" w:cs="Arial"/>
+                <w:iCs/>
+                <w:sz w:val="20"/>
+                <w:szCs w:val="20"/>
+                <w:lang w:eastAsia="es-CL"/>
+              </w:rPr>
+              <w:t>Las actividades del proyecto que no se han realizado son las relacionadas al Chat Bot, que sería la ayuda que se le podría otorgar al usuario, mediante comandos de voz o de manera escrita y a su vez el método de pago, el cual está en desarrollo el poder integrar aún este mismo, no hemos poder cumplir el plazo de este último que es el que se nos atrasó debido a que preferimos darle enfoque a las partes más claves del proyecto como lo son la navegación por voz y el poder hacer un correcto CRUD, las estrategias para poder avanzar en estos mismos sería tener una gran comunicación como equipo, informar en todo momento en lo que se avanzará y como se avanzará y a su vez poder hacerlo en conjunto para poder apoyarnos en caso de que ocurra algún error en el proceso de desarrollo.</w:t>
+            </w:r>
           </w:p>
           <w:p>
             <w:pPr>
@@ -3311,7 +3229,7 @@
 </file>
 
 <file path=word/endnotes.xml><?xml version="1.0" encoding="utf-8"?>
-<w:endnotes xmlns:wpc="http://schemas.microsoft.com/office/word/2010/wordprocessingCanvas" xmlns:cx="http://schemas.microsoft.com/office/drawing/2014/chartex" xmlns:mc="http://schemas.openxmlformats.org/markup-compatibility/2006" xmlns:o="urn:schemas-microsoft-com:office:office" xmlns:r="http://schemas.openxmlformats.org/officeDocument/2006/relationships" xmlns:m="http://schemas.openxmlformats.org/officeDocument/2006/math" xmlns:v="urn:schemas-microsoft-com:vml" xmlns:wp14="http://schemas.microsoft.com/office/word/2010/wordprocessingDrawing" xmlns:wp="http://schemas.openxmlformats.org/drawingml/2006/wordprocessingDrawing" xmlns:w10="urn:schemas-microsoft-com:office:word" xmlns:w="http://schemas.openxmlformats.org/wordprocessingml/2006/main" xmlns:w14="http://schemas.microsoft.com/office/word/2010/wordml" xmlns:w15="http://schemas.microsoft.com/office/word/2012/wordml" xmlns:w16se="http://schemas.microsoft.com/office/word/2015/wordml/symex" xmlns:wpg="http://schemas.microsoft.com/office/word/2010/wordprocessingGroup" xmlns:wpi="http://schemas.microsoft.com/office/word/2010/wordprocessingInk" xmlns:wne="http://schemas.microsoft.com/office/word/2006/wordml" xmlns:wps="http://schemas.microsoft.com/office/word/2010/wordprocessingShape" mc:Ignorable="w14 w15 w16se wp14">
+<w:endnotes xmlns:wpc="http://schemas.microsoft.com/office/word/2010/wordprocessingCanvas" xmlns:cx="http://schemas.microsoft.com/office/drawing/2014/chartex" xmlns:cx1="http://schemas.microsoft.com/office/drawing/2015/9/8/chartex" xmlns:cx2="http://schemas.microsoft.com/office/drawing/2015/10/21/chartex" xmlns:cx3="http://schemas.microsoft.com/office/drawing/2016/5/9/chartex" xmlns:cx4="http://schemas.microsoft.com/office/drawing/2016/5/10/chartex" xmlns:cx5="http://schemas.microsoft.com/office/drawing/2016/5/11/chartex" xmlns:cx6="http://schemas.microsoft.com/office/drawing/2016/5/12/chartex" xmlns:cx7="http://schemas.microsoft.com/office/drawing/2016/5/13/chartex" xmlns:cx8="http://schemas.microsoft.com/office/drawing/2016/5/14/chartex" xmlns:mc="http://schemas.openxmlformats.org/markup-compatibility/2006" xmlns:aink="http://schemas.microsoft.com/office/drawing/2016/ink" xmlns:am3d="http://schemas.microsoft.com/office/drawing/2017/model3d" xmlns:o="urn:schemas-microsoft-com:office:office" xmlns:r="http://schemas.openxmlformats.org/officeDocument/2006/relationships" xmlns:m="http://schemas.openxmlformats.org/officeDocument/2006/math" xmlns:v="urn:schemas-microsoft-com:vml" xmlns:wp14="http://schemas.microsoft.com/office/word/2010/wordprocessingDrawing" xmlns:wp="http://schemas.openxmlformats.org/drawingml/2006/wordprocessingDrawing" xmlns:w10="urn:schemas-microsoft-com:office:word" xmlns:w="http://schemas.openxmlformats.org/wordprocessingml/2006/main" xmlns:w14="http://schemas.microsoft.com/office/word/2010/wordml" xmlns:w15="http://schemas.microsoft.com/office/word/2012/wordml" xmlns:w16cex="http://schemas.microsoft.com/office/word/2018/wordml/cex" xmlns:w16cid="http://schemas.microsoft.com/office/word/2016/wordml/cid" xmlns:w16="http://schemas.microsoft.com/office/word/2018/wordml" xmlns:w16sdtdh="http://schemas.microsoft.com/office/word/2020/wordml/sdtdatahash" xmlns:w16se="http://schemas.microsoft.com/office/word/2015/wordml/symex" xmlns:wpg="http://schemas.microsoft.com/office/word/2010/wordprocessingGroup" xmlns:wpi="http://schemas.microsoft.com/office/word/2010/wordprocessingInk" xmlns:wne="http://schemas.microsoft.com/office/word/2006/wordml" xmlns:wps="http://schemas.microsoft.com/office/word/2010/wordprocessingShape" mc:Ignorable="w14 w15 w16se w16cid w16 w16cex w16sdtdh wp14">
   <w:endnote w:type="separator" w:id="-1">
     <w:p>
       <w:pPr>
@@ -3336,7 +3254,7 @@
 </file>
 
 <file path=word/footnotes.xml><?xml version="1.0" encoding="utf-8"?>
-<w:footnotes xmlns:wpc="http://schemas.microsoft.com/office/word/2010/wordprocessingCanvas" xmlns:cx="http://schemas.microsoft.com/office/drawing/2014/chartex" xmlns:mc="http://schemas.openxmlformats.org/markup-compatibility/2006" xmlns:o="urn:schemas-microsoft-com:office:office" xmlns:r="http://schemas.openxmlformats.org/officeDocument/2006/relationships" xmlns:m="http://schemas.openxmlformats.org/officeDocument/2006/math" xmlns:v="urn:schemas-microsoft-com:vml" xmlns:wp14="http://schemas.microsoft.com/office/word/2010/wordprocessingDrawing" xmlns:wp="http://schemas.openxmlformats.org/drawingml/2006/wordprocessingDrawing" xmlns:w10="urn:schemas-microsoft-com:office:word" xmlns:w="http://schemas.openxmlformats.org/wordprocessingml/2006/main" xmlns:w14="http://schemas.microsoft.com/office/word/2010/wordml" xmlns:w15="http://schemas.microsoft.com/office/word/2012/wordml" xmlns:w16se="http://schemas.microsoft.com/office/word/2015/wordml/symex" xmlns:wpg="http://schemas.microsoft.com/office/word/2010/wordprocessingGroup" xmlns:wpi="http://schemas.microsoft.com/office/word/2010/wordprocessingInk" xmlns:wne="http://schemas.microsoft.com/office/word/2006/wordml" xmlns:wps="http://schemas.microsoft.com/office/word/2010/wordprocessingShape" mc:Ignorable="w14 w15 w16se wp14">
+<w:footnotes xmlns:wpc="http://schemas.microsoft.com/office/word/2010/wordprocessingCanvas" xmlns:cx="http://schemas.microsoft.com/office/drawing/2014/chartex" xmlns:cx1="http://schemas.microsoft.com/office/drawing/2015/9/8/chartex" xmlns:cx2="http://schemas.microsoft.com/office/drawing/2015/10/21/chartex" xmlns:cx3="http://schemas.microsoft.com/office/drawing/2016/5/9/chartex" xmlns:cx4="http://schemas.microsoft.com/office/drawing/2016/5/10/chartex" xmlns:cx5="http://schemas.microsoft.com/office/drawing/2016/5/11/chartex" xmlns:cx6="http://schemas.microsoft.com/office/drawing/2016/5/12/chartex" xmlns:cx7="http://schemas.microsoft.com/office/drawing/2016/5/13/chartex" xmlns:cx8="http://schemas.microsoft.com/office/drawing/2016/5/14/chartex" xmlns:mc="http://schemas.openxmlformats.org/markup-compatibility/2006" xmlns:aink="http://schemas.microsoft.com/office/drawing/2016/ink" xmlns:am3d="http://schemas.microsoft.com/office/drawing/2017/model3d" xmlns:o="urn:schemas-microsoft-com:office:office" xmlns:r="http://schemas.openxmlformats.org/officeDocument/2006/relationships" xmlns:m="http://schemas.openxmlformats.org/officeDocument/2006/math" xmlns:v="urn:schemas-microsoft-com:vml" xmlns:wp14="http://schemas.microsoft.com/office/word/2010/wordprocessingDrawing" xmlns:wp="http://schemas.openxmlformats.org/drawingml/2006/wordprocessingDrawing" xmlns:w10="urn:schemas-microsoft-com:office:word" xmlns:w="http://schemas.openxmlformats.org/wordprocessingml/2006/main" xmlns:w14="http://schemas.microsoft.com/office/word/2010/wordml" xmlns:w15="http://schemas.microsoft.com/office/word/2012/wordml" xmlns:w16cex="http://schemas.microsoft.com/office/word/2018/wordml/cex" xmlns:w16cid="http://schemas.microsoft.com/office/word/2016/wordml/cid" xmlns:w16="http://schemas.microsoft.com/office/word/2018/wordml" xmlns:w16sdtdh="http://schemas.microsoft.com/office/word/2020/wordml/sdtdatahash" xmlns:w16se="http://schemas.microsoft.com/office/word/2015/wordml/symex" xmlns:wpg="http://schemas.microsoft.com/office/word/2010/wordprocessingGroup" xmlns:wpi="http://schemas.microsoft.com/office/word/2010/wordprocessingInk" xmlns:wne="http://schemas.microsoft.com/office/word/2006/wordml" xmlns:wps="http://schemas.microsoft.com/office/word/2010/wordprocessingShape" mc:Ignorable="w14 w15 w16se w16cid w16 w16cex w16sdtdh wp14">
   <w:footnote w:type="separator" w:id="-1">
     <w:p>
       <w:pPr>
@@ -3419,7 +3337,7 @@
 </file>
 
 <file path=word/header1.xml><?xml version="1.0" encoding="utf-8"?>
-<w:hdr xmlns:wpc="http://schemas.microsoft.com/office/word/2010/wordprocessingCanvas" xmlns:cx="http://schemas.microsoft.com/office/drawing/2014/chartex" xmlns:mc="http://schemas.openxmlformats.org/markup-compatibility/2006" xmlns:o="urn:schemas-microsoft-com:office:office" xmlns:r="http://schemas.openxmlformats.org/officeDocument/2006/relationships" xmlns:m="http://schemas.openxmlformats.org/officeDocument/2006/math" xmlns:v="urn:schemas-microsoft-com:vml" xmlns:wp14="http://schemas.microsoft.com/office/word/2010/wordprocessingDrawing" xmlns:wp="http://schemas.openxmlformats.org/drawingml/2006/wordprocessingDrawing" xmlns:w10="urn:schemas-microsoft-com:office:word" xmlns:w="http://schemas.openxmlformats.org/wordprocessingml/2006/main" xmlns:w14="http://schemas.microsoft.com/office/word/2010/wordml" xmlns:w15="http://schemas.microsoft.com/office/word/2012/wordml" xmlns:w16se="http://schemas.microsoft.com/office/word/2015/wordml/symex" xmlns:wpg="http://schemas.microsoft.com/office/word/2010/wordprocessingGroup" xmlns:wpi="http://schemas.microsoft.com/office/word/2010/wordprocessingInk" xmlns:wne="http://schemas.microsoft.com/office/word/2006/wordml" xmlns:wps="http://schemas.microsoft.com/office/word/2010/wordprocessingShape" mc:Ignorable="w14 w15 w16se wp14">
+<w:hdr xmlns:wpc="http://schemas.microsoft.com/office/word/2010/wordprocessingCanvas" xmlns:cx="http://schemas.microsoft.com/office/drawing/2014/chartex" xmlns:cx1="http://schemas.microsoft.com/office/drawing/2015/9/8/chartex" xmlns:cx2="http://schemas.microsoft.com/office/drawing/2015/10/21/chartex" xmlns:cx3="http://schemas.microsoft.com/office/drawing/2016/5/9/chartex" xmlns:cx4="http://schemas.microsoft.com/office/drawing/2016/5/10/chartex" xmlns:cx5="http://schemas.microsoft.com/office/drawing/2016/5/11/chartex" xmlns:cx6="http://schemas.microsoft.com/office/drawing/2016/5/12/chartex" xmlns:cx7="http://schemas.microsoft.com/office/drawing/2016/5/13/chartex" xmlns:cx8="http://schemas.microsoft.com/office/drawing/2016/5/14/chartex" xmlns:mc="http://schemas.openxmlformats.org/markup-compatibility/2006" xmlns:aink="http://schemas.microsoft.com/office/drawing/2016/ink" xmlns:am3d="http://schemas.microsoft.com/office/drawing/2017/model3d" xmlns:o="urn:schemas-microsoft-com:office:office" xmlns:r="http://schemas.openxmlformats.org/officeDocument/2006/relationships" xmlns:m="http://schemas.openxmlformats.org/officeDocument/2006/math" xmlns:v="urn:schemas-microsoft-com:vml" xmlns:wp14="http://schemas.microsoft.com/office/word/2010/wordprocessingDrawing" xmlns:wp="http://schemas.openxmlformats.org/drawingml/2006/wordprocessingDrawing" xmlns:w10="urn:schemas-microsoft-com:office:word" xmlns:w="http://schemas.openxmlformats.org/wordprocessingml/2006/main" xmlns:w14="http://schemas.microsoft.com/office/word/2010/wordml" xmlns:w15="http://schemas.microsoft.com/office/word/2012/wordml" xmlns:w16cex="http://schemas.microsoft.com/office/word/2018/wordml/cex" xmlns:w16cid="http://schemas.microsoft.com/office/word/2016/wordml/cid" xmlns:w16="http://schemas.microsoft.com/office/word/2018/wordml" xmlns:w16sdtdh="http://schemas.microsoft.com/office/word/2020/wordml/sdtdatahash" xmlns:w16se="http://schemas.microsoft.com/office/word/2015/wordml/symex" xmlns:wpg="http://schemas.microsoft.com/office/word/2010/wordprocessingGroup" xmlns:wpi="http://schemas.microsoft.com/office/word/2010/wordprocessingInk" xmlns:wne="http://schemas.microsoft.com/office/word/2006/wordml" xmlns:wps="http://schemas.microsoft.com/office/word/2010/wordprocessingShape" mc:Ignorable="w14 w15 w16se w16cid w16 w16cex w16sdtdh wp14">
   <w:tbl>
     <w:tblPr>
       <w:tblStyle w:val="Tablaconcuadrcula1"/>
@@ -3644,7 +3562,7 @@
 </file>
 
 <file path=word/numbering.xml><?xml version="1.0" encoding="utf-8"?>
-<w:numbering xmlns:wpc="http://schemas.microsoft.com/office/word/2010/wordprocessingCanvas" xmlns:cx="http://schemas.microsoft.com/office/drawing/2014/chartex" xmlns:mc="http://schemas.openxmlformats.org/markup-compatibility/2006" xmlns:o="urn:schemas-microsoft-com:office:office" xmlns:r="http://schemas.openxmlformats.org/officeDocument/2006/relationships" xmlns:m="http://schemas.openxmlformats.org/officeDocument/2006/math" xmlns:v="urn:schemas-microsoft-com:vml" xmlns:wp14="http://schemas.microsoft.com/office/word/2010/wordprocessingDrawing" xmlns:wp="http://schemas.openxmlformats.org/drawingml/2006/wordprocessingDrawing" xmlns:w10="urn:schemas-microsoft-com:office:word" xmlns:w="http://schemas.openxmlformats.org/wordprocessingml/2006/main" xmlns:w14="http://schemas.microsoft.com/office/word/2010/wordml" xmlns:w15="http://schemas.microsoft.com/office/word/2012/wordml" xmlns:w16se="http://schemas.microsoft.com/office/word/2015/wordml/symex" xmlns:wpg="http://schemas.microsoft.com/office/word/2010/wordprocessingGroup" xmlns:wpi="http://schemas.microsoft.com/office/word/2010/wordprocessingInk" xmlns:wne="http://schemas.microsoft.com/office/word/2006/wordml" xmlns:wps="http://schemas.microsoft.com/office/word/2010/wordprocessingShape" mc:Ignorable="w14 w15 w16se wp14">
+<w:numbering xmlns:wpc="http://schemas.microsoft.com/office/word/2010/wordprocessingCanvas" xmlns:cx="http://schemas.microsoft.com/office/drawing/2014/chartex" xmlns:cx1="http://schemas.microsoft.com/office/drawing/2015/9/8/chartex" xmlns:cx2="http://schemas.microsoft.com/office/drawing/2015/10/21/chartex" xmlns:cx3="http://schemas.microsoft.com/office/drawing/2016/5/9/chartex" xmlns:cx4="http://schemas.microsoft.com/office/drawing/2016/5/10/chartex" xmlns:cx5="http://schemas.microsoft.com/office/drawing/2016/5/11/chartex" xmlns:cx6="http://schemas.microsoft.com/office/drawing/2016/5/12/chartex" xmlns:cx7="http://schemas.microsoft.com/office/drawing/2016/5/13/chartex" xmlns:cx8="http://schemas.microsoft.com/office/drawing/2016/5/14/chartex" xmlns:mc="http://schemas.openxmlformats.org/markup-compatibility/2006" xmlns:aink="http://schemas.microsoft.com/office/drawing/2016/ink" xmlns:am3d="http://schemas.microsoft.com/office/drawing/2017/model3d" xmlns:o="urn:schemas-microsoft-com:office:office" xmlns:r="http://schemas.openxmlformats.org/officeDocument/2006/relationships" xmlns:m="http://schemas.openxmlformats.org/officeDocument/2006/math" xmlns:v="urn:schemas-microsoft-com:vml" xmlns:wp14="http://schemas.microsoft.com/office/word/2010/wordprocessingDrawing" xmlns:wp="http://schemas.openxmlformats.org/drawingml/2006/wordprocessingDrawing" xmlns:w10="urn:schemas-microsoft-com:office:word" xmlns:w="http://schemas.openxmlformats.org/wordprocessingml/2006/main" xmlns:w14="http://schemas.microsoft.com/office/word/2010/wordml" xmlns:w15="http://schemas.microsoft.com/office/word/2012/wordml" xmlns:w16cex="http://schemas.microsoft.com/office/word/2018/wordml/cex" xmlns:w16cid="http://schemas.microsoft.com/office/word/2016/wordml/cid" xmlns:w16="http://schemas.microsoft.com/office/word/2018/wordml" xmlns:w16sdtdh="http://schemas.microsoft.com/office/word/2020/wordml/sdtdatahash" xmlns:w16se="http://schemas.microsoft.com/office/word/2015/wordml/symex" xmlns:wpg="http://schemas.microsoft.com/office/word/2010/wordprocessingGroup" xmlns:wpi="http://schemas.microsoft.com/office/word/2010/wordprocessingInk" xmlns:wne="http://schemas.microsoft.com/office/word/2006/wordml" xmlns:wps="http://schemas.microsoft.com/office/word/2010/wordprocessingShape" mc:Ignorable="w14 w15 w16se w16cid w16 w16cex w16sdtdh wp14">
   <w:abstractNum w:abstractNumId="0" w15:restartNumberingAfterBreak="0">
     <w:nsid w:val="2FFD4C7F"/>
     <w:multiLevelType w:val="multilevel"/>
@@ -3773,7 +3691,7 @@
 </file>
 
 <file path=word/styles.xml><?xml version="1.0" encoding="utf-8"?>
-<w:styles xmlns:mc="http://schemas.openxmlformats.org/markup-compatibility/2006" xmlns:r="http://schemas.openxmlformats.org/officeDocument/2006/relationships" xmlns:w="http://schemas.openxmlformats.org/wordprocessingml/2006/main" xmlns:w14="http://schemas.microsoft.com/office/word/2010/wordml" xmlns:w15="http://schemas.microsoft.com/office/word/2012/wordml" xmlns:w16se="http://schemas.microsoft.com/office/word/2015/wordml/symex" mc:Ignorable="w14 w15 w16se">
+<w:styles xmlns:mc="http://schemas.openxmlformats.org/markup-compatibility/2006" xmlns:r="http://schemas.openxmlformats.org/officeDocument/2006/relationships" xmlns:w="http://schemas.openxmlformats.org/wordprocessingml/2006/main" xmlns:w14="http://schemas.microsoft.com/office/word/2010/wordml" xmlns:w15="http://schemas.microsoft.com/office/word/2012/wordml" xmlns:w16cex="http://schemas.microsoft.com/office/word/2018/wordml/cex" xmlns:w16cid="http://schemas.microsoft.com/office/word/2016/wordml/cid" xmlns:w16="http://schemas.microsoft.com/office/word/2018/wordml" xmlns:w16sdtdh="http://schemas.microsoft.com/office/word/2020/wordml/sdtdatahash" xmlns:w16se="http://schemas.microsoft.com/office/word/2015/wordml/symex" mc:Ignorable="w14 w15 w16se w16cid w16 w16cex w16sdtdh">
   <w:docDefaults>
     <w:rPrDefault>
       <w:rPr>
@@ -3785,7 +3703,7 @@
     </w:rPrDefault>
     <w:pPrDefault/>
   </w:docDefaults>
-  <w:latentStyles w:defLockedState="0" w:defUIPriority="99" w:defSemiHidden="0" w:defUnhideWhenUsed="0" w:defQFormat="0" w:count="371">
+  <w:latentStyles w:defLockedState="0" w:defUIPriority="99" w:defSemiHidden="0" w:defUnhideWhenUsed="0" w:defQFormat="0" w:count="376">
     <w:lsdException w:name="Normal" w:uiPriority="0" w:qFormat="1"/>
     <w:lsdException w:name="heading 1" w:uiPriority="9" w:qFormat="1"/>
     <w:lsdException w:name="heading 2" w:semiHidden="1" w:uiPriority="9" w:unhideWhenUsed="1" w:qFormat="1"/>
@@ -3891,7 +3809,6 @@
     <w:lsdException w:name="HTML Sample" w:semiHidden="1" w:unhideWhenUsed="1"/>
     <w:lsdException w:name="HTML Typewriter" w:semiHidden="1" w:unhideWhenUsed="1"/>
     <w:lsdException w:name="HTML Variable" w:semiHidden="1" w:unhideWhenUsed="1"/>
-    <w:lsdException w:name="Normal Table" w:semiHidden="1" w:unhideWhenUsed="1"/>
     <w:lsdException w:name="annotation subject" w:semiHidden="1" w:unhideWhenUsed="1"/>
     <w:lsdException w:name="No List" w:semiHidden="1" w:unhideWhenUsed="1"/>
     <w:lsdException w:name="Outline List 1" w:semiHidden="1" w:unhideWhenUsed="1"/>
@@ -3934,11 +3851,8 @@
     <w:lsdException w:name="Table Contemporary" w:semiHidden="1" w:unhideWhenUsed="1"/>
     <w:lsdException w:name="Table Elegant" w:semiHidden="1" w:unhideWhenUsed="1"/>
     <w:lsdException w:name="Table Professional" w:semiHidden="1" w:unhideWhenUsed="1"/>
-    <w:lsdException w:name="Table Subtle 1" w:semiHidden="1" w:unhideWhenUsed="1"/>
     <w:lsdException w:name="Table Subtle 2" w:semiHidden="1" w:unhideWhenUsed="1"/>
     <w:lsdException w:name="Table Web 1" w:semiHidden="1" w:unhideWhenUsed="1"/>
-    <w:lsdException w:name="Table Web 2" w:semiHidden="1" w:unhideWhenUsed="1"/>
-    <w:lsdException w:name="Table Web 3" w:semiHidden="1" w:unhideWhenUsed="1"/>
     <w:lsdException w:name="Balloon Text" w:semiHidden="1" w:unhideWhenUsed="1"/>
     <w:lsdException w:name="Table Grid" w:uiPriority="39"/>
     <w:lsdException w:name="Table Theme" w:semiHidden="1" w:unhideWhenUsed="1"/>
@@ -4157,6 +4071,11 @@
     <w:lsdException w:name="List Table 5 Dark Accent 6" w:uiPriority="50"/>
     <w:lsdException w:name="List Table 6 Colorful Accent 6" w:uiPriority="51"/>
     <w:lsdException w:name="List Table 7 Colorful Accent 6" w:uiPriority="52"/>
+    <w:lsdException w:name="Mention" w:semiHidden="1" w:unhideWhenUsed="1"/>
+    <w:lsdException w:name="Smart Hyperlink" w:semiHidden="1" w:unhideWhenUsed="1"/>
+    <w:lsdException w:name="Hashtag" w:semiHidden="1" w:unhideWhenUsed="1"/>
+    <w:lsdException w:name="Unresolved Mention" w:semiHidden="1" w:unhideWhenUsed="1"/>
+    <w:lsdException w:name="Smart Link" w:semiHidden="1" w:unhideWhenUsed="1"/>
   </w:latentStyles>
   <w:style w:type="paragraph" w:default="1" w:styleId="Normal">
     <w:name w:val="Normal"/>
@@ -4759,9 +4678,12 @@
 </file>
 
 <file path=customXml/item1.xml><?xml version="1.0" encoding="utf-8"?>
-<p:properties xmlns:p="http://schemas.microsoft.com/office/2006/metadata/properties" xmlns:xsi="http://www.w3.org/2001/XMLSchema-instance" xmlns:pc="http://schemas.microsoft.com/office/infopath/2007/PartnerControls">
-  <documentManagement/>
-</p:properties>
+<?mso-contentType ?>
+<FormTemplates xmlns="http://schemas.microsoft.com/sharepoint/v3/contenttype/forms">
+  <Display>DocumentLibraryForm</Display>
+  <Edit>DocumentLibraryForm</Edit>
+  <New>DocumentLibraryForm</New>
+</FormTemplates>
 </file>
 
 <file path=customXml/item2.xml><?xml version="1.0" encoding="utf-8"?>
@@ -4897,26 +4819,15 @@
 </file>
 
 <file path=customXml/item3.xml><?xml version="1.0" encoding="utf-8"?>
-<?mso-contentType ?>
-<FormTemplates xmlns="http://schemas.microsoft.com/sharepoint/v3/contenttype/forms">
-  <Display>DocumentLibraryForm</Display>
-  <Edit>DocumentLibraryForm</Edit>
-  <New>DocumentLibraryForm</New>
-</FormTemplates>
+<p:properties xmlns:p="http://schemas.microsoft.com/office/2006/metadata/properties" xmlns:xsi="http://www.w3.org/2001/XMLSchema-instance" xmlns:pc="http://schemas.microsoft.com/office/infopath/2007/PartnerControls">
+  <documentManagement/>
+</p:properties>
 </file>
 
 <file path=customXml/itemProps1.xml><?xml version="1.0" encoding="utf-8"?>
-<ds:datastoreItem xmlns:ds="http://schemas.openxmlformats.org/officeDocument/2006/customXml" ds:itemID="{46CA5683-AF87-4E40-B841-2E23A3B52406}">
+<ds:datastoreItem xmlns:ds="http://schemas.openxmlformats.org/officeDocument/2006/customXml" ds:itemID="{D51C61E4-DB75-4684-AD25-71F546404E96}">
   <ds:schemaRefs>
-    <ds:schemaRef ds:uri="http://purl.org/dc/terms/"/>
-    <ds:schemaRef ds:uri="http://purl.org/dc/elements/1.1/"/>
-    <ds:schemaRef ds:uri="http://schemas.openxmlformats.org/package/2006/metadata/core-properties"/>
-    <ds:schemaRef ds:uri="http://www.w3.org/XML/1998/namespace"/>
-    <ds:schemaRef ds:uri="http://schemas.microsoft.com/office/2006/metadata/properties"/>
-    <ds:schemaRef ds:uri="http://schemas.microsoft.com/office/2006/documentManagement/types"/>
-    <ds:schemaRef ds:uri="http://purl.org/dc/dcmitype/"/>
-    <ds:schemaRef ds:uri="http://schemas.microsoft.com/office/infopath/2007/PartnerControls"/>
-    <ds:schemaRef ds:uri="126e8a1c-9ea9-435a-ac89-d06c80d62e30"/>
+    <ds:schemaRef ds:uri="http://schemas.microsoft.com/sharepoint/v3/contenttype/forms"/>
   </ds:schemaRefs>
 </ds:datastoreItem>
 </file>
@@ -4940,9 +4851,10 @@
 </file>
 
 <file path=customXml/itemProps3.xml><?xml version="1.0" encoding="utf-8"?>
-<ds:datastoreItem xmlns:ds="http://schemas.openxmlformats.org/officeDocument/2006/customXml" ds:itemID="{D51C61E4-DB75-4684-AD25-71F546404E96}">
+<ds:datastoreItem xmlns:ds="http://schemas.openxmlformats.org/officeDocument/2006/customXml" ds:itemID="{46CA5683-AF87-4E40-B841-2E23A3B52406}">
   <ds:schemaRefs>
-    <ds:schemaRef ds:uri="http://schemas.microsoft.com/sharepoint/v3/contenttype/forms"/>
+    <ds:schemaRef ds:uri="http://schemas.microsoft.com/office/2006/metadata/properties"/>
+    <ds:schemaRef ds:uri="http://schemas.microsoft.com/office/infopath/2007/PartnerControls"/>
   </ds:schemaRefs>
 </ds:datastoreItem>
 </file>
</xml_diff>